<commit_message>
fix(proposal): address advisor feedback on simulation scope, FSM integration, hardware compatibility, and doc formatting
</commit_message>
<xml_diff>
--- a/docs/academic/PROJECT_PROPOSAL.docx
+++ b/docs/academic/PROJECT_PROPOSAL.docx
@@ -32,6 +32,7 @@
     </w:p>
     <w:p>
       <w:pPr>
+        <w:pStyle w:val="Heading1"/>
         <w:keepNext/>
         <w:spacing w:before="240" w:after="80"/>
       </w:pPr>
@@ -82,6 +83,7 @@
     </w:p>
     <w:p>
       <w:pPr>
+        <w:pStyle w:val="Heading1"/>
         <w:keepNext/>
         <w:spacing w:before="240" w:after="80"/>
       </w:pPr>
@@ -141,11 +143,12 @@
     </w:p>
     <w:p>
       <w:r>
-        <w:t>To resolve these challenges, this research proposes a robust, fault-tolerant OTA firmware management architecture. The platform introduces a deterministic Canary Phased Rollout Engine (20% -&gt; 60% -&gt; 100%) designed to restrict failure exposure to a minor sentinel group with automated rollback capabilities. This is integrated with a lightweight ECDSA NIST P-256 asymmetric cryptographic verification pipeline executed directly on edge robot controllers prior to flashing. This approach transforms industrial firmware delivery from a high-risk manual intervention into an autonomous, fault-tolerant, and zero-trust engineering operation.</w:t>
+        <w:t>To resolve these challenges, this research proposes a robust, fault-tolerant OTA firmware management architecture. The platform introduces a deterministic Canary Phased Rollout Engine (20% → 60% → 100%) designed to restrict failure exposure to a minor sentinel group with automated rollback capabilities. This is integrated with a lightweight ECDSA NIST P-256 asymmetric cryptographic verification pipeline executed directly on edge robot controllers prior to flashing. This approach transforms industrial firmware delivery from a high-risk manual intervention into an autonomous, fault-tolerant, and zero-trust engineering operation.</w:t>
       </w:r>
     </w:p>
     <w:p>
       <w:pPr>
+        <w:pStyle w:val="Heading1"/>
         <w:keepNext/>
         <w:spacing w:before="240" w:after="80"/>
       </w:pPr>
@@ -213,6 +216,7 @@
     </w:p>
     <w:p>
       <w:pPr>
+        <w:pStyle w:val="Heading1"/>
         <w:keepNext/>
         <w:spacing w:before="240" w:after="80"/>
       </w:pPr>
@@ -262,7 +266,7 @@
         <w:t xml:space="preserve">Edge Robot Architecture: </w:t>
       </w:r>
       <w:r>
-        <w:t>Formal Finite State Machine (FSM) managing transition cycles: Idle -&gt; Downloading -&gt; Verifying -&gt; Installing -&gt; Rebooting -&gt; Online / Rollback.</w:t>
+        <w:t>Formal Finite State Machine (FSM) managing transition cycles: Idle → Downloading → Verifying → Installing → Rebooting → Online / Rollback.</w:t>
       </w:r>
     </w:p>
     <w:p>
@@ -278,7 +282,7 @@
         <w:t xml:space="preserve">Canary Orchestration Engine: </w:t>
       </w:r>
       <w:r>
-        <w:t>Algorithmic division of fleet populations into progressive tranches (20% -&gt; 60% -&gt; 100%) with automated circuit-breaking triggers upon exceeding predefined error thresholds.</w:t>
+        <w:t>Algorithmic division of fleet populations into progressive tranches (20% → 60% → 100%) with automated circuit-breaking triggers upon exceeding predefined error thresholds.</w:t>
       </w:r>
     </w:p>
     <w:p>
@@ -291,10 +295,10 @@
         <w:rPr>
           <w:b/>
         </w:rPr>
-        <w:t xml:space="preserve">Cloud &amp; Storage Infrastructure: </w:t>
+        <w:t xml:space="preserve">Cloud and Storage Infrastructure: </w:t>
       </w:r>
       <w:r>
-        <w:t>Go Fiber v3 backend control plane, PostgreSQL 16 relational store for fleet metadata and deployment audit trails, MinIO / S3-compatible Object Storage for firmware binary delivery via time-limited Presigned URLs, and EMQX MQTT 5.0 (QoS 1) broker for low-latency command orchestration. (Redis is excluded from the system architecture).</w:t>
+        <w:t>Go Fiber v3 backend control plane, PostgreSQL 16 and MinIO S3-compatible Object Storage for fleet metadata, deployment audit trails, and firmware binary delivery via time-limited Presigned URLs, alongside an EMQX MQTT 5.0 (QoS 1) broker for low-latency command orchestration.</w:t>
       </w:r>
     </w:p>
     <w:p>
@@ -310,7 +314,7 @@
         <w:t xml:space="preserve">Auxiliary Data Processing &amp; Machine Learning: </w:t>
       </w:r>
       <w:r>
-        <w:t>Post-experiment exploratory analysis using Scikit-learn (Random Forest Regression for latency feature importance and Isolation Forest for outlier detection) evaluated on empirical dataset (N = 290 trials) as an analytical study tool rather than an active real-time runtime component.</w:t>
+        <w:t>Post-experiment exploratory analysis using Scikit-learn (Random Forest Regression for latency feature importance and Isolation Forest for outlier detection) evaluated on a synthetic simulation dataset (N = 290 trials) as an analytical study tool rather than an active real-time runtime component.</w:t>
       </w:r>
     </w:p>
     <w:p>
@@ -323,14 +327,15 @@
         <w:rPr>
           <w:b/>
         </w:rPr>
-        <w:t xml:space="preserve">Empirical Validation Matrix: </w:t>
+        <w:t xml:space="preserve">Simulation-Based Evaluation Matrix: </w:t>
       </w:r>
       <w:r>
-        <w:t>Systematic evaluation across 5 operational scenarios (N = 290 repeated trials) covering nominal baseline execution, cryptographic threat mitigation, fault resilience A/B benchmarking, network stress conditions (150-500 ms latency, 0-10% packet loss), and cross-hardware compatibility verification.</w:t>
+        <w:t>Systematic evaluation across 5 operational scenarios (N = 290 repeated simulation trials) covering nominal baseline execution, cryptographic threat mitigation, fault resilience A/B benchmarking, network stress conditions (150-500 ms latency, 0-10% packet loss), and cross-hardware compatibility verification.</w:t>
       </w:r>
     </w:p>
     <w:p>
       <w:pPr>
+        <w:pStyle w:val="Heading1"/>
         <w:keepNext/>
         <w:spacing w:before="240" w:after="80"/>
       </w:pPr>
@@ -760,7 +765,13 @@
       </w:pPr>
     </w:p>
     <w:p>
+      <w:r>
+        <w:br w:type="page"/>
+      </w:r>
+    </w:p>
+    <w:p>
       <w:pPr>
+        <w:pStyle w:val="Heading1"/>
         <w:keepNext/>
         <w:spacing w:before="240" w:after="80"/>
       </w:pPr>
@@ -823,7 +834,7 @@
         <w:rPr>
           <w:b/>
         </w:rPr>
-        <w:t xml:space="preserve">Empirical Benchmarking &amp; Statistical Evaluation: </w:t>
+        <w:t xml:space="preserve">Simulation Benchmarking &amp; Statistical Evaluation: </w:t>
       </w:r>
       <w:r>
         <w:t>Non-parametric hypothesis testing (Mann-Whitney U, Shapiro-Wilk normality tests), confidence interval estimation (95% CI), and A/B fault testing.</w:t>
@@ -842,11 +853,12 @@
         <w:t xml:space="preserve">Core Engineering Stack: </w:t>
       </w:r>
       <w:r>
-        <w:t>Go (Golang) for high-concurrency orchestrator routines, PostgreSQL 16 &amp; MinIO for metadata and S3 object storage, and Next.js 14 / TypeScript for operator UI.</w:t>
+        <w:t>Go (Golang) for high-concurrency orchestrator routines, PostgreSQL 16 and MinIO for metadata and S3 object storage, and Next.js 14 / TypeScript for operator UI.</w:t>
       </w:r>
     </w:p>
     <w:p>
       <w:pPr>
+        <w:pStyle w:val="Heading1"/>
         <w:keepNext/>
         <w:spacing w:before="240" w:after="80"/>
       </w:pPr>
@@ -1031,7 +1043,7 @@
           </w:tcPr>
           <w:p>
             <w:r>
-              <w:t>Developing the multi-scenario automated test runner and fault-injection scripts for controlled empirical benchmarking.</w:t>
+              <w:t>Developing the multi-scenario automated test runner and fault-injection scripts for controlled simulation benchmarking.</w:t>
             </w:r>
           </w:p>
         </w:tc>
@@ -1052,7 +1064,7 @@
               <w:rPr>
                 <w:b/>
               </w:rPr>
-              <w:t>Phase 4: Empirical Benchmarking &amp; Statistical Evaluation</w:t>
+              <w:t>Phase 4: Simulation Benchmarking &amp; Statistical Evaluation</w:t>
             </w:r>
           </w:p>
         </w:tc>
@@ -1120,6 +1132,7 @@
     </w:p>
     <w:p>
       <w:pPr>
+        <w:pStyle w:val="Heading1"/>
         <w:keepNext/>
         <w:spacing w:before="240" w:after="80"/>
       </w:pPr>
@@ -1179,7 +1192,7 @@
         <w:t xml:space="preserve">Zero-Trust Edge Cryptographic Integrity: </w:t>
       </w:r>
       <w:r>
-        <w:t>Delivers an empirically validated, zero-trust verification framework capable of executing on industrial edge controllers with minimal latency overhead, confirming real-time viability without disrupting motor motion-control loops.</w:t>
+        <w:t>Provides a framework for evaluating cryptographic verification overhead on simulated edge nodes, with future validation required on representative industrial robot controllers.</w:t>
       </w:r>
     </w:p>
     <w:p>
@@ -1640,15 +1653,15 @@
     <w:pPr>
       <w:keepNext/>
       <w:keepLines/>
-      <w:spacing w:before="480" w:after="0"/>
+      <w:spacing w:before="240" w:after="80"/>
       <w:outlineLvl w:val="0"/>
     </w:pPr>
     <w:rPr>
-      <w:rFonts w:asciiTheme="majorHAnsi" w:eastAsiaTheme="majorEastAsia" w:hAnsiTheme="majorHAnsi" w:cstheme="majorBidi"/>
+      <w:rFonts w:asciiTheme="majorHAnsi" w:eastAsiaTheme="majorEastAsia" w:hAnsiTheme="majorHAnsi" w:cstheme="majorBidi" w:ascii="Arial" w:hAnsi="Arial"/>
       <w:b/>
       <w:bCs/>
-      <w:color w:val="365F91" w:themeColor="accent1" w:themeShade="BF"/>
-      <w:sz w:val="28"/>
+      <w:color w:val="1B365D"/>
+      <w:sz w:val="24"/>
       <w:szCs w:val="28"/>
     </w:rPr>
   </w:style>

</xml_diff>